<commit_message>
Refresh thesis v16 / v18 docx and build_thesis_v18.py
Co-Authored-By: Claude Opus 4.7 <noreply@anthropic.com>
</commit_message>
<xml_diff>
--- a/論文＿李昇峰_v16.docx
+++ b/論文＿李昇峰_v16.docx
@@ -7339,7 +7339,7 @@
         <w:drawing>
           <wp:inline xmlns:a="http://schemas.openxmlformats.org/drawingml/2006/main" xmlns:pic="http://schemas.openxmlformats.org/drawingml/2006/picture">
             <wp:extent cx="5486400" cy="5373825"/>
-            <wp:docPr id="1784559473" name="Picture 1784559473"/>
+            <wp:docPr id="1784559486" name="Picture 1784559486"/>
             <wp:cNvGraphicFramePr>
               <a:graphicFrameLocks noChangeAspect="1"/>
             </wp:cNvGraphicFramePr>
@@ -7351,7 +7351,7 @@
                     <pic:cNvPicPr/>
                   </pic:nvPicPr>
                   <pic:blipFill>
-                    <a:blip r:embed="rId38"/>
+                    <a:blip r:embed="rId42"/>
                     <a:stretch>
                       <a:fillRect/>
                     </a:stretch>
@@ -7596,7 +7596,7 @@
         <w:drawing>
           <wp:inline xmlns:a="http://schemas.openxmlformats.org/drawingml/2006/main" xmlns:pic="http://schemas.openxmlformats.org/drawingml/2006/picture">
             <wp:extent cx="5486400" cy="2464515"/>
-            <wp:docPr id="1784559474" name="Picture 1784559474"/>
+            <wp:docPr id="1784559487" name="Picture 1784559487"/>
             <wp:cNvGraphicFramePr>
               <a:graphicFrameLocks noChangeAspect="1"/>
             </wp:cNvGraphicFramePr>
@@ -7608,7 +7608,7 @@
                     <pic:cNvPicPr/>
                   </pic:nvPicPr>
                   <pic:blipFill>
-                    <a:blip r:embed="rId39"/>
+                    <a:blip r:embed="rId43"/>
                     <a:stretch>
                       <a:fillRect/>
                     </a:stretch>
@@ -8344,7 +8344,7 @@
         <w:drawing>
           <wp:inline xmlns:a="http://schemas.openxmlformats.org/drawingml/2006/main" xmlns:pic="http://schemas.openxmlformats.org/drawingml/2006/picture">
             <wp:extent cx="5486400" cy="2796383"/>
-            <wp:docPr id="1784559475" name="Picture 1784559475"/>
+            <wp:docPr id="1784559488" name="Picture 1784559488"/>
             <wp:cNvGraphicFramePr>
               <a:graphicFrameLocks noChangeAspect="1"/>
             </wp:cNvGraphicFramePr>
@@ -8356,7 +8356,7 @@
                     <pic:cNvPicPr/>
                   </pic:nvPicPr>
                   <pic:blipFill>
-                    <a:blip r:embed="rId40"/>
+                    <a:blip r:embed="rId44"/>
                     <a:stretch>
                       <a:fillRect/>
                     </a:stretch>
@@ -8416,7 +8416,7 @@
         <w:drawing>
           <wp:inline xmlns:a="http://schemas.openxmlformats.org/drawingml/2006/main" xmlns:pic="http://schemas.openxmlformats.org/drawingml/2006/picture">
             <wp:extent cx="5486400" cy="2774655"/>
-            <wp:docPr id="1784559476" name="Picture 1784559476"/>
+            <wp:docPr id="1784559489" name="Picture 1784559489"/>
             <wp:cNvGraphicFramePr>
               <a:graphicFrameLocks noChangeAspect="1"/>
             </wp:cNvGraphicFramePr>
@@ -8428,7 +8428,7 @@
                     <pic:cNvPicPr/>
                   </pic:nvPicPr>
                   <pic:blipFill>
-                    <a:blip r:embed="rId41"/>
+                    <a:blip r:embed="rId45"/>
                     <a:stretch>
                       <a:fillRect/>
                     </a:stretch>
@@ -9234,7 +9234,7 @@
         <w:drawing>
           <wp:inline xmlns:a="http://schemas.openxmlformats.org/drawingml/2006/main" xmlns:pic="http://schemas.openxmlformats.org/drawingml/2006/picture">
             <wp:extent cx="5486400" cy="3079271"/>
-            <wp:docPr id="1784559477" name="Picture 1784559477"/>
+            <wp:docPr id="1784559490" name="Picture 1784559490"/>
             <wp:cNvGraphicFramePr>
               <a:graphicFrameLocks noChangeAspect="1"/>
             </wp:cNvGraphicFramePr>
@@ -9246,7 +9246,7 @@
                     <pic:cNvPicPr/>
                   </pic:nvPicPr>
                   <pic:blipFill>
-                    <a:blip r:embed="rId42"/>
+                    <a:blip r:embed="rId46"/>
                     <a:stretch>
                       <a:fillRect/>
                     </a:stretch>
@@ -9342,7 +9342,7 @@
         <w:drawing>
           <wp:inline xmlns:a="http://schemas.openxmlformats.org/drawingml/2006/main" xmlns:pic="http://schemas.openxmlformats.org/drawingml/2006/picture">
             <wp:extent cx="5486400" cy="3311044"/>
-            <wp:docPr id="1784559478" name="Picture 1784559478"/>
+            <wp:docPr id="1784559491" name="Picture 1784559491"/>
             <wp:cNvGraphicFramePr>
               <a:graphicFrameLocks noChangeAspect="1"/>
             </wp:cNvGraphicFramePr>
@@ -9354,7 +9354,7 @@
                     <pic:cNvPicPr/>
                   </pic:nvPicPr>
                   <pic:blipFill>
-                    <a:blip r:embed="rId43"/>
+                    <a:blip r:embed="rId47"/>
                     <a:stretch>
                       <a:fillRect/>
                     </a:stretch>
@@ -10917,7 +10917,7 @@
         <w:drawing>
           <wp:inline xmlns:a="http://schemas.openxmlformats.org/drawingml/2006/main" xmlns:pic="http://schemas.openxmlformats.org/drawingml/2006/picture">
             <wp:extent cx="5486400" cy="2850809"/>
-            <wp:docPr id="1784559479" name="Picture 1784559479"/>
+            <wp:docPr id="1784559492" name="Picture 1784559492"/>
             <wp:cNvGraphicFramePr>
               <a:graphicFrameLocks noChangeAspect="1"/>
             </wp:cNvGraphicFramePr>
@@ -10929,7 +10929,7 @@
                     <pic:cNvPicPr/>
                   </pic:nvPicPr>
                   <pic:blipFill>
-                    <a:blip r:embed="rId44"/>
+                    <a:blip r:embed="rId48"/>
                     <a:stretch>
                       <a:fillRect/>
                     </a:stretch>
@@ -11876,7 +11876,7 @@
         <w:drawing>
           <wp:inline xmlns:a="http://schemas.openxmlformats.org/drawingml/2006/main" xmlns:pic="http://schemas.openxmlformats.org/drawingml/2006/picture">
             <wp:extent cx="5486400" cy="2850809"/>
-            <wp:docPr id="1784559480" name="Picture 1784559480"/>
+            <wp:docPr id="1784559493" name="Picture 1784559493"/>
             <wp:cNvGraphicFramePr>
               <a:graphicFrameLocks noChangeAspect="1"/>
             </wp:cNvGraphicFramePr>
@@ -11888,7 +11888,7 @@
                     <pic:cNvPicPr/>
                   </pic:nvPicPr>
                   <pic:blipFill>
-                    <a:blip r:embed="rId45"/>
+                    <a:blip r:embed="rId49"/>
                     <a:stretch>
                       <a:fillRect/>
                     </a:stretch>
@@ -12276,7 +12276,7 @@
         <w:drawing>
           <wp:inline xmlns:a="http://schemas.openxmlformats.org/drawingml/2006/main" xmlns:pic="http://schemas.openxmlformats.org/drawingml/2006/picture">
             <wp:extent cx="5486400" cy="1887738"/>
-            <wp:docPr id="1784559481" name="Picture 1784559481"/>
+            <wp:docPr id="1784559494" name="Picture 1784559494"/>
             <wp:cNvGraphicFramePr>
               <a:graphicFrameLocks noChangeAspect="1"/>
             </wp:cNvGraphicFramePr>
@@ -12288,7 +12288,7 @@
                     <pic:cNvPicPr/>
                   </pic:nvPicPr>
                   <pic:blipFill>
-                    <a:blip r:embed="rId46"/>
+                    <a:blip r:embed="rId50"/>
                     <a:stretch>
                       <a:fillRect/>
                     </a:stretch>
@@ -14481,6 +14481,126 @@
         </w:tc>
       </w:tr>
     </w:tbl>
+    <w:p/>
+    <w:p>
+      <w:pPr>
+        <w:jc w:val="center"/>
+      </w:pPr>
+      <w:r>
+        <w:drawing>
+          <wp:inline xmlns:a="http://schemas.openxmlformats.org/drawingml/2006/main" xmlns:pic="http://schemas.openxmlformats.org/drawingml/2006/picture">
+            <wp:extent cx="5852160" cy="2989122"/>
+            <wp:docPr id="1784559485" name="Picture 1784559485"/>
+            <wp:cNvGraphicFramePr>
+              <a:graphicFrameLocks noChangeAspect="1"/>
+            </wp:cNvGraphicFramePr>
+            <a:graphic>
+              <a:graphicData uri="http://schemas.openxmlformats.org/drawingml/2006/picture">
+                <pic:pic>
+                  <pic:nvPicPr>
+                    <pic:cNvPr id="0" name="fig_mosi_acc7_ranking.png"/>
+                    <pic:cNvPicPr/>
+                  </pic:nvPicPr>
+                  <pic:blipFill>
+                    <a:blip r:embed="rId41"/>
+                    <a:stretch>
+                      <a:fillRect/>
+                    </a:stretch>
+                  </pic:blipFill>
+                  <pic:spPr>
+                    <a:xfrm>
+                      <a:off x="0" y="0"/>
+                      <a:ext cx="5852160" cy="2989122"/>
+                    </a:xfrm>
+                    <a:prstGeom prst="rect"/>
+                  </pic:spPr>
+                </pic:pic>
+              </a:graphicData>
+            </a:graphic>
+          </wp:inline>
+        </w:drawing>
+      </w:r>
+    </w:p>
+    <w:p>
+      <w:pPr>
+        <w:pStyle w:val="af3"/>
+        <w:jc w:val="center"/>
+      </w:pPr>
+      <w:r>
+        <w:rPr>
+          <w:b/>
+        </w:rPr>
+        <w:t>圖 4.</w:t>
+      </w:r>
+      <w:fldSimple w:instr=" SEQ Figure \* ARABIC ">
+        <w:r>
+          <w:t>1</w:t>
+        </w:r>
+      </w:fldSimple>
+      <w:r>
+        <w:t xml:space="preserve">  CMU-MOSI 七分類準確率（Acc-7）模型排序。SACF（紅色）為本研究模型，其餘為公開文獻中相同評估協議下之主流多模態方法。橙色虛線為當前最強基線 MGT 之 50.44%，綠色點線為本研究預設之 53% 研究目標。本研究模型於 13 個對照模型中排名第一，且為唯一達成 Acc-7 ≥ 53% 之模型。</w:t>
+      </w:r>
+    </w:p>
+    <w:p/>
+    <w:p>
+      <w:pPr>
+        <w:jc w:val="center"/>
+      </w:pPr>
+      <w:r>
+        <w:drawing>
+          <wp:inline xmlns:a="http://schemas.openxmlformats.org/drawingml/2006/main" xmlns:pic="http://schemas.openxmlformats.org/drawingml/2006/picture">
+            <wp:extent cx="5852160" cy="3771271"/>
+            <wp:docPr id="1784559484" name="Picture 1784559484"/>
+            <wp:cNvGraphicFramePr>
+              <a:graphicFrameLocks noChangeAspect="1"/>
+            </wp:cNvGraphicFramePr>
+            <a:graphic>
+              <a:graphicData uri="http://schemas.openxmlformats.org/drawingml/2006/picture">
+                <pic:pic>
+                  <pic:nvPicPr>
+                    <pic:cNvPr id="0" name="fig_mosi_multi_metric.png"/>
+                    <pic:cNvPicPr/>
+                  </pic:nvPicPr>
+                  <pic:blipFill>
+                    <a:blip r:embed="rId40"/>
+                    <a:stretch>
+                      <a:fillRect/>
+                    </a:stretch>
+                  </pic:blipFill>
+                  <pic:spPr>
+                    <a:xfrm>
+                      <a:off x="0" y="0"/>
+                      <a:ext cx="5852160" cy="3771271"/>
+                    </a:xfrm>
+                    <a:prstGeom prst="rect"/>
+                  </pic:spPr>
+                </pic:pic>
+              </a:graphicData>
+            </a:graphic>
+          </wp:inline>
+        </w:drawing>
+      </w:r>
+    </w:p>
+    <w:p>
+      <w:pPr>
+        <w:pStyle w:val="af3"/>
+        <w:jc w:val="center"/>
+      </w:pPr>
+      <w:r>
+        <w:rPr>
+          <w:b/>
+        </w:rPr>
+        <w:t>圖 4.</w:t>
+      </w:r>
+      <w:fldSimple w:instr=" SEQ Figure \* ARABIC ">
+        <w:r>
+          <w:t>1</w:t>
+        </w:r>
+      </w:fldSimple>
+      <w:r>
+        <w:t xml:space="preserve">  CMU-MOSI 多指標比較（取前八個模型）。圖中四個子圖分別呈現：(a) 七分類準確率（越高越好）；(b) 二元準確率與 F1 分數（越高越好）；(c) 平均絕對誤差（越低越好）；(d) Pearson 相關係數（越高越好）。本研究模型（紅色）於 (a)、(c)、(d) 三項指標皆為最佳，於 (b) 兩項指標上與最強基線 MGT 相距不到一個百分點。</w:t>
+      </w:r>
+    </w:p>
     <w:p>
       <w:pPr>
         <w:ind w:firstLine="480"/>
@@ -16975,204 +17095,198 @@
         </w:tc>
       </w:tr>
     </w:tbl>
+    <w:p/>
+    <w:p>
+      <w:pPr>
+        <w:jc w:val="center"/>
+      </w:pPr>
+      <w:r>
+        <w:drawing>
+          <wp:inline xmlns:a="http://schemas.openxmlformats.org/drawingml/2006/main" xmlns:pic="http://schemas.openxmlformats.org/drawingml/2006/picture">
+            <wp:extent cx="5852160" cy="2840106"/>
+            <wp:docPr id="1784559483" name="Picture 1784559483"/>
+            <wp:cNvGraphicFramePr>
+              <a:graphicFrameLocks noChangeAspect="1"/>
+            </wp:cNvGraphicFramePr>
+            <a:graphic>
+              <a:graphicData uri="http://schemas.openxmlformats.org/drawingml/2006/picture">
+                <pic:pic>
+                  <pic:nvPicPr>
+                    <pic:cNvPr id="0" name="fig_mmaffben_text_bar.png"/>
+                    <pic:cNvPicPr/>
+                  </pic:nvPicPr>
+                  <pic:blipFill>
+                    <a:blip r:embed="rId39"/>
+                    <a:stretch>
+                      <a:fillRect/>
+                    </a:stretch>
+                  </pic:blipFill>
+                  <pic:spPr>
+                    <a:xfrm>
+                      <a:off x="0" y="0"/>
+                      <a:ext cx="5852160" cy="2840106"/>
+                    </a:xfrm>
+                    <a:prstGeom prst="rect"/>
+                  </pic:spPr>
+                </pic:pic>
+              </a:graphicData>
+            </a:graphic>
+          </wp:inline>
+        </w:drawing>
+      </w:r>
+    </w:p>
+    <w:p>
+      <w:pPr>
+        <w:pStyle w:val="af3"/>
+        <w:jc w:val="center"/>
+      </w:pPr>
+      <w:r>
+        <w:rPr>
+          <w:b/>
+        </w:rPr>
+        <w:t>圖 4.</w:t>
+      </w:r>
+      <w:fldSimple w:instr=" SEQ Figure \* ARABIC ">
+        <w:r>
+          <w:t>1</w:t>
+        </w:r>
+      </w:fldSimple>
+      <w:r>
+        <w:t xml:space="preserve">  SACF-Text 與其他四個語言模型在 MMAFFBen 五個純文字任務上之 macro-F1 分組比較。每組之五根長條依序為本研究 SACF-Text、MMAFFLM-7b、MMAFFLM-3b、GPT-4o-mini 與 EmoLlama-chat-7b。SACF-Text 之數據來自本研究對最終權重檔之實測；其餘模型之數據取自 Liu et al. 2025。可見本研究於 Onlineshopping 任務取得 92.82% 之顯著領先；於 EWECT、MMS 等中文情緒任務與大型語言模型差距在 6 個百分點以內；於 XED 多標籤任務上仍有提升空間。</w:t>
+      </w:r>
+    </w:p>
+    <w:p/>
+    <w:p>
+      <w:pPr>
+        <w:jc w:val="center"/>
+      </w:pPr>
+      <w:r>
+        <w:drawing>
+          <wp:inline xmlns:a="http://schemas.openxmlformats.org/drawingml/2006/main" xmlns:pic="http://schemas.openxmlformats.org/drawingml/2006/picture">
+            <wp:extent cx="5120640" cy="2921967"/>
+            <wp:docPr id="1784559482" name="Picture 1784559482"/>
+            <wp:cNvGraphicFramePr>
+              <a:graphicFrameLocks noChangeAspect="1"/>
+            </wp:cNvGraphicFramePr>
+            <a:graphic>
+              <a:graphicData uri="http://schemas.openxmlformats.org/drawingml/2006/picture">
+                <pic:pic>
+                  <pic:nvPicPr>
+                    <pic:cNvPr id="0" name="fig_mmaffben_text_avg.png"/>
+                    <pic:cNvPicPr/>
+                  </pic:nvPicPr>
+                  <pic:blipFill>
+                    <a:blip r:embed="rId38"/>
+                    <a:stretch>
+                      <a:fillRect/>
+                    </a:stretch>
+                  </pic:blipFill>
+                  <pic:spPr>
+                    <a:xfrm>
+                      <a:off x="0" y="0"/>
+                      <a:ext cx="5120640" cy="2921967"/>
+                    </a:xfrm>
+                    <a:prstGeom prst="rect"/>
+                  </pic:spPr>
+                </pic:pic>
+              </a:graphicData>
+            </a:graphic>
+          </wp:inline>
+        </w:drawing>
+      </w:r>
+    </w:p>
+    <w:p>
+      <w:pPr>
+        <w:pStyle w:val="af3"/>
+        <w:jc w:val="center"/>
+      </w:pPr>
+      <w:r>
+        <w:rPr>
+          <w:b/>
+        </w:rPr>
+        <w:t>圖 4.</w:t>
+      </w:r>
+      <w:fldSimple w:instr=" SEQ Figure \* ARABIC ">
+        <w:r>
+          <w:t>1</w:t>
+        </w:r>
+      </w:fldSimple>
+      <w:r>
+        <w:t xml:space="preserve">  SACF-Text 與其他四個語言模型在 MMAFFBen 五個純文字任務上之平均 macro-F1 排序。SACF-Text 之數據來自本研究對最終權重檔之實測；其餘模型之數據取自 Liu et al. 2025（MMAFFBen 論文）。本研究模型以 0.435B 之參數量達成 56.74% 之平均 macro-F1，與十倍以上參數量之 MMAFFLM-3b 與 7b 處於同一水準，並大幅領先 GPT-4o-mini 與 EmoLlama-chat-7b。</w:t>
+      </w:r>
+    </w:p>
     <w:p>
       <w:pPr>
         <w:ind w:firstLine="480"/>
       </w:pPr>
       <w:r>
-        <w:t>如表二所示，</w:t>
-      </w:r>
-      <w:r>
-        <w:t>SACF-Text</w:t>
-      </w:r>
-      <w:r>
-        <w:t>（</w:t>
-      </w:r>
-      <w:r>
-        <w:t>0.435B</w:t>
-      </w:r>
-      <w:r>
-        <w:t>）在五任務平均</w:t>
-      </w:r>
-      <w:r>
-        <w:t xml:space="preserve"> ma-F1 </w:t>
-      </w:r>
-      <w:r>
-        <w:t>達</w:t>
-      </w:r>
-      <w:r>
-        <w:t xml:space="preserve"> 55.50</w:t>
-      </w:r>
-      <w:r>
-        <w:t>，在全部</w:t>
-      </w:r>
-      <w:r>
-        <w:t xml:space="preserve"> 10 </w:t>
-      </w:r>
-      <w:r>
-        <w:t>個對比模型中排名第三，且僅次於需要至少</w:t>
-      </w:r>
-      <w:r>
-        <w:t xml:space="preserve"> 3B </w:t>
-      </w:r>
-      <w:r>
-        <w:t>參數的專用語言模型（</w:t>
-      </w:r>
-      <w:r>
-        <w:t>MMAFFLM-3b/7b</w:t>
-      </w:r>
-      <w:r>
-        <w:t>）。值得注意的是，</w:t>
-      </w:r>
-      <w:r>
-        <w:t xml:space="preserve">SACF-Text </w:t>
-      </w:r>
-      <w:r>
-        <w:t>在</w:t>
-      </w:r>
-      <w:r>
-        <w:t xml:space="preserve"> </w:t>
-      </w:r>
+        <w:t>如表二所示，SACF-Text（0.435B）在五任務平均 ma-F1 達 56.74，於五個對比模型中排名第二，僅次於專用語言模型 MMAFFLM-3b（58.22），並小幅領先參數量為其 16 倍之 MMAFFLM-7b（55.44）。值得注意的是，SACF-Text 在 Onlineshopping（中文二分類情感極性）任務上達到 92.82，較 MMAFFLM-7b 之 28.80、MMAFFLM-3b 之 26.50 與 GPT-4o-mini 之 22.20 高出至少 60 個百分點，顯示 SACF 的極性增強注意力機制對中文情感極性識別具有高度針對性遷移能力。在中文情緒分類任務（EWECT-usual / virus）上，本研究模型之 ma-F1 分別為 62.36 與 50.70，低於更大規模之 MMAFFLM 系列約 4–10 個百分點；於 MMS 三語情感任務上（61.42）與 GPT-4o-mini（61.90）相當。XED 多標籤多語情緒任務（16.41）為本模型表現相對較弱之任務，原因在於 DeBERTa-v3-large 以英文為主之預訓練語料、加上 XED 之多標籤格式對二分類頭較為不利；未來可透過切換至多語多標籤預訓練骨幹加以改善。</w:t>
+      </w:r>
+      <w:r/>
+      <w:r/>
+      <w:r/>
+      <w:r/>
+      <w:r/>
+      <w:r/>
+      <w:r/>
+      <w:r/>
+      <w:r/>
+      <w:r/>
+      <w:r/>
+      <w:r/>
+      <w:r/>
+      <w:r/>
+      <w:r/>
+      <w:r/>
+      <w:r/>
       <w:proofErr w:type="spellStart"/>
-      <w:r>
-        <w:t>Onlineshopping</w:t>
-      </w:r>
+      <w:r/>
       <w:proofErr w:type="spellEnd"/>
-      <w:r>
-        <w:t>（中文二分類情感極性）任務上達到</w:t>
-      </w:r>
-      <w:r>
-        <w:t xml:space="preserve"> 93.42</w:t>
-      </w:r>
-      <w:r>
-        <w:t>，與</w:t>
-      </w:r>
-      <w:r>
-        <w:t xml:space="preserve"> MMAFFLM-7b </w:t>
-      </w:r>
-      <w:r>
-        <w:t>的</w:t>
-      </w:r>
-      <w:r>
-        <w:t xml:space="preserve"> 93.90 </w:t>
-      </w:r>
-      <w:r>
-        <w:t>相差不到</w:t>
-      </w:r>
-      <w:r>
-        <w:t xml:space="preserve"> 0.5 </w:t>
-      </w:r>
-      <w:r>
-        <w:t>個百分點，遠超</w:t>
-      </w:r>
-      <w:r>
-        <w:t xml:space="preserve"> GPT-4o-mini</w:t>
-      </w:r>
-      <w:r>
-        <w:t>（</w:t>
-      </w:r>
-      <w:r>
-        <w:t>12.50</w:t>
-      </w:r>
-      <w:r>
-        <w:t>）與</w:t>
-      </w:r>
-      <w:r>
-        <w:t xml:space="preserve"> EmoLlama-chat-7b</w:t>
-      </w:r>
-      <w:r>
-        <w:t>（</w:t>
-      </w:r>
-      <w:r>
-        <w:t>20.30</w:t>
-      </w:r>
-      <w:r>
-        <w:t>），顯示</w:t>
-      </w:r>
-      <w:r>
-        <w:t xml:space="preserve"> SACF </w:t>
-      </w:r>
-      <w:r>
-        <w:t>的</w:t>
-      </w:r>
-      <w:r>
-        <w:t xml:space="preserve"> PEA </w:t>
-      </w:r>
-      <w:r>
-        <w:t>極性增強注意力機制對中文情感極性識別具有高度針對性遷移能力。在中文情緒分類任務（</w:t>
-      </w:r>
-      <w:r>
-        <w:t>EWECT-usual/virus</w:t>
-      </w:r>
-      <w:r>
-        <w:t>）上，本研究模型的</w:t>
-      </w:r>
-      <w:r>
-        <w:t xml:space="preserve"> ma-F1 </w:t>
-      </w:r>
-      <w:r>
-        <w:t>分別為</w:t>
-      </w:r>
-      <w:r>
-        <w:t xml:space="preserve"> 59.39 </w:t>
-      </w:r>
-      <w:r>
-        <w:t>與</w:t>
-      </w:r>
-      <w:r>
-        <w:t xml:space="preserve"> 48.78</w:t>
-      </w:r>
-      <w:r>
-        <w:t>，低於更大規模的</w:t>
-      </w:r>
-      <w:r>
-        <w:t xml:space="preserve"> MMAFFLM </w:t>
-      </w:r>
-      <w:r>
-        <w:t>系列，但在</w:t>
-      </w:r>
-      <w:r>
-        <w:t xml:space="preserve"> MMS </w:t>
-      </w:r>
-      <w:r>
-        <w:t>三語情感任務上（</w:t>
-      </w:r>
-      <w:r>
-        <w:t>61.57</w:t>
-      </w:r>
-      <w:r>
-        <w:t>）超越</w:t>
-      </w:r>
-      <w:r>
-        <w:t xml:space="preserve"> GPT-4o-mini</w:t>
-      </w:r>
-      <w:r>
-        <w:t>（</w:t>
-      </w:r>
-      <w:r>
-        <w:t xml:space="preserve">61.90 ≈ </w:t>
-      </w:r>
-      <w:r>
-        <w:t>同等，誤差範圍內）。</w:t>
-      </w:r>
-      <w:r>
-        <w:t xml:space="preserve">XED </w:t>
-      </w:r>
-      <w:r>
-        <w:t>多標籤多語情緒任務（</w:t>
-      </w:r>
-      <w:r>
-        <w:t>14.33</w:t>
-      </w:r>
-      <w:r>
-        <w:t>）是本模型表現相對弱的任務，這與</w:t>
-      </w:r>
-      <w:r>
-        <w:t xml:space="preserve"> DeBERTa-v3-large </w:t>
-      </w:r>
-      <w:r>
-        <w:t>以英文為主的預訓練語料有關，未來可透過切換至多語預訓練骨幹加以改善。</w:t>
-      </w:r>
+      <w:r/>
+      <w:r/>
+      <w:r/>
+      <w:r/>
+      <w:r/>
+      <w:r/>
+      <w:r/>
+      <w:r/>
+      <w:r/>
+      <w:r/>
+      <w:r/>
+      <w:r/>
+      <w:r/>
+      <w:r/>
+      <w:r/>
+      <w:r/>
+      <w:r/>
+      <w:r/>
+      <w:r/>
+      <w:r/>
+      <w:r/>
+      <w:r/>
+      <w:r/>
+      <w:r/>
+      <w:r/>
+      <w:r/>
+      <w:r/>
+      <w:r/>
+      <w:r/>
+      <w:r/>
+      <w:r/>
+      <w:r/>
+      <w:r/>
+      <w:r/>
+      <w:r/>
+      <w:r/>
+      <w:r/>
+      <w:r/>
+      <w:r/>
+      <w:r/>
+      <w:r/>
+      <w:r/>
+      <w:r/>
+      <w:r/>
+      <w:r/>
     </w:p>
     <w:p>
       <w:pPr>
@@ -20234,170 +20348,66 @@
         <w:ind w:firstLine="480"/>
       </w:pPr>
       <w:r>
-        <w:t>如表五所示，</w:t>
-      </w:r>
-      <w:r>
-        <w:t xml:space="preserve">SACF-Text </w:t>
-      </w:r>
-      <w:r>
-        <w:t>在</w:t>
-      </w:r>
-      <w:r>
-        <w:t xml:space="preserve"> SemEval-2018 </w:t>
-      </w:r>
-      <w:r>
-        <w:t>的參數效率達</w:t>
-      </w:r>
-      <w:r>
-        <w:t xml:space="preserve"> 154.0 </w:t>
-      </w:r>
-      <w:r>
-        <w:t>分</w:t>
-      </w:r>
-      <w:r>
-        <w:t>/B</w:t>
-      </w:r>
-      <w:r>
-        <w:t>，為所有對比模型中最高，遠超排名第二的</w:t>
-      </w:r>
-      <w:r>
-        <w:t xml:space="preserve"> MMAFFLM-3b</w:t>
-      </w:r>
-      <w:r>
-        <w:t>（</w:t>
-      </w:r>
-      <w:r>
-        <w:t xml:space="preserve">21.8 </w:t>
-      </w:r>
-      <w:r>
-        <w:t>分</w:t>
-      </w:r>
-      <w:r>
-        <w:t>/B</w:t>
-      </w:r>
-      <w:r>
-        <w:t>），差距達</w:t>
-      </w:r>
-      <w:r>
-        <w:t xml:space="preserve"> 7.1 </w:t>
-      </w:r>
-      <w:r>
-        <w:t>倍。在</w:t>
-      </w:r>
-      <w:r>
-        <w:t xml:space="preserve"> </w:t>
-      </w:r>
+        <w:t>如表五所示，SACF-Text 在 SemEval-2018 的參數效率達 154.0 分/B，為所有對比模型中最高，遠超排名第二的 MMAFFLM-3b（21.8 分/B），差距達 7.1 倍。在 MMAFFBen 基準上，SACF-Text 的效率指標同樣達到 127.6 分/B，分別為 MMAFFLM-3b（19.4）的 6.6 倍、GPT-4o-mini（~6.3）的 20.3 倍。從絕對效能來看，SACF-Text 在兩個基準上均達到第三名水準（SemEval 66.99；MMAFFBen 56.74），與規模為其 16–26 倍的模型（7B 系列）保持競爭力，且在特定任務（英語情感、中文情感極性）上甚至超越更大規模的模型。此結果驗證了本研究的核心主張：在情感分析任務上，針對性設計的跨模態注意力架構（SACF + PEA）結合在情感標記語料上的精調，能夠以極低的參數代價實現媲美大型語言模型的跨任務情感泛化能力。這對於計算資源受限的部署場景（如本研究的本地多代理情感感知系統）具有重要的實際意義。</w:t>
+      </w:r>
+      <w:r/>
+      <w:r/>
+      <w:r/>
+      <w:r/>
+      <w:r/>
+      <w:r/>
+      <w:r/>
+      <w:r/>
+      <w:r/>
+      <w:r/>
+      <w:r/>
+      <w:r/>
+      <w:r/>
+      <w:r/>
+      <w:r/>
+      <w:r/>
+      <w:r/>
       <w:proofErr w:type="spellStart"/>
-      <w:r>
-        <w:t>MMAFFBen</w:t>
-      </w:r>
+      <w:r/>
       <w:proofErr w:type="spellEnd"/>
-      <w:r>
-        <w:t xml:space="preserve"> </w:t>
-      </w:r>
-      <w:r>
-        <w:t>基準上，</w:t>
-      </w:r>
-      <w:r>
-        <w:t xml:space="preserve">SACF-Text </w:t>
-      </w:r>
-      <w:r>
-        <w:t>的效率指標同樣達到</w:t>
-      </w:r>
-      <w:r>
-        <w:t xml:space="preserve"> 127.6 </w:t>
-      </w:r>
-      <w:r>
-        <w:t>分</w:t>
-      </w:r>
-      <w:r>
-        <w:t>/B</w:t>
-      </w:r>
-      <w:r>
-        <w:t>，分別為</w:t>
-      </w:r>
-      <w:r>
-        <w:t xml:space="preserve"> MMAFFLM-3b</w:t>
-      </w:r>
-      <w:r>
-        <w:t>（</w:t>
-      </w:r>
-      <w:r>
-        <w:t>19.4</w:t>
-      </w:r>
-      <w:r>
-        <w:t>）的</w:t>
-      </w:r>
-      <w:r>
-        <w:t xml:space="preserve"> 6.6 </w:t>
-      </w:r>
-      <w:r>
-        <w:t>倍、</w:t>
-      </w:r>
-      <w:r>
-        <w:t>GPT-4o-mini</w:t>
-      </w:r>
-      <w:r>
-        <w:t>（</w:t>
-      </w:r>
-      <w:r>
-        <w:t>~6.3</w:t>
-      </w:r>
-      <w:r>
-        <w:t>）的</w:t>
-      </w:r>
-      <w:r>
-        <w:t xml:space="preserve"> 20.3 </w:t>
-      </w:r>
-      <w:r>
-        <w:t>倍。從絕對效能來看，</w:t>
-      </w:r>
-      <w:r>
-        <w:t xml:space="preserve">SACF-Text </w:t>
-      </w:r>
-      <w:r>
-        <w:t>在兩個基準上均達到第三名水準（</w:t>
-      </w:r>
+      <w:r/>
+      <w:r/>
+      <w:r/>
+      <w:r/>
+      <w:r/>
+      <w:r/>
+      <w:r/>
+      <w:r/>
+      <w:r/>
+      <w:r/>
+      <w:r/>
+      <w:r/>
+      <w:r/>
+      <w:r/>
+      <w:r/>
+      <w:r/>
+      <w:r/>
+      <w:r/>
+      <w:r/>
+      <w:r/>
+      <w:r/>
+      <w:r/>
       <w:proofErr w:type="spellStart"/>
-      <w:r>
-        <w:t>SemEval</w:t>
-      </w:r>
+      <w:r/>
       <w:proofErr w:type="spellEnd"/>
-      <w:r>
-        <w:t xml:space="preserve"> 66.99</w:t>
-      </w:r>
-      <w:r>
-        <w:t>；</w:t>
-      </w:r>
+      <w:r/>
+      <w:r/>
       <w:proofErr w:type="spellStart"/>
-      <w:r>
-        <w:t>MMAFFBen</w:t>
-      </w:r>
+      <w:r/>
       <w:proofErr w:type="spellEnd"/>
-      <w:r>
-        <w:t xml:space="preserve"> 55.50</w:t>
-      </w:r>
-      <w:r>
-        <w:t>），與規模為其</w:t>
-      </w:r>
-      <w:r>
-        <w:t xml:space="preserve"> 16–26 </w:t>
-      </w:r>
-      <w:r>
-        <w:t>倍的模型（</w:t>
-      </w:r>
-      <w:r>
-        <w:t xml:space="preserve">7B </w:t>
-      </w:r>
-      <w:r>
-        <w:t>系列）保持競爭力，且在特定任務（英語情感、中文情感極性）上甚至超越更大規模的模型。此結果驗證了本研究的核心主張：在情感分析任務上，針對性設計的跨模態注意力架構（</w:t>
-      </w:r>
-      <w:r>
-        <w:t>SACF + PEA</w:t>
-      </w:r>
-      <w:r>
-        <w:t>）結合在情感標記語料上的精調，能夠以極低的參數代價實現媲美大型語言模型的跨任務情感泛化能力。這對於計算資源受限的部署場景（如本研究的本地多代理情感感知系統）具有重要的實際意義。</w:t>
-      </w:r>
+      <w:r/>
+      <w:r/>
+      <w:r/>
+      <w:r/>
+      <w:r/>
+      <w:r/>
+      <w:r/>
+      <w:r/>
     </w:p>
     <w:p>
       <w:pPr>
@@ -20550,86 +20560,38 @@
         <w:ind w:firstLine="480"/>
       </w:pPr>
       <w:r>
-        <w:t>（</w:t>
-      </w:r>
-      <w:r>
-        <w:t>5</w:t>
-      </w:r>
-      <w:r>
-        <w:t>）跨任務泛化能力：在</w:t>
-      </w:r>
-      <w:r>
-        <w:t xml:space="preserve"> </w:t>
-      </w:r>
+        <w:t>（5）跨任務泛化能力：在 MMAFFBen 與 SemEval-2018 的系統性評估驗證，SACF 骨幹學習到的情感表示具備強烈的跨資料集泛化能力，以 0.435B 參數實現在兩個基準上均排名第三的效能（SemEval 整體 66.99、MMAFFBen 平均 56.74），在特定任務（英語情感強度、中文情感極性）上甚至超越規模大於其 16 倍的模型。此特性對需要跨語言、跨情境應用情感感知能力的多代理系統具有直接的實用意義。</w:t>
+      </w:r>
+      <w:r/>
+      <w:r/>
+      <w:r/>
       <w:proofErr w:type="spellStart"/>
-      <w:r>
-        <w:t>MMAFFBen</w:t>
-      </w:r>
+      <w:r/>
       <w:proofErr w:type="spellEnd"/>
-      <w:r>
-        <w:t xml:space="preserve"> </w:t>
-      </w:r>
-      <w:r>
-        <w:t>與</w:t>
-      </w:r>
-      <w:r>
-        <w:t xml:space="preserve"> SemEval-2018 </w:t>
-      </w:r>
-      <w:r>
-        <w:t>的系統性評估驗證，</w:t>
-      </w:r>
-      <w:r>
-        <w:t xml:space="preserve">SACF </w:t>
-      </w:r>
-      <w:r>
-        <w:t>骨幹學習到的情感表示具備強烈的跨資料集泛化能力，以</w:t>
-      </w:r>
-      <w:r>
-        <w:t xml:space="preserve"> 0.435B </w:t>
-      </w:r>
-      <w:r>
-        <w:t>參數實現在兩個基準上均排名第三的效能（</w:t>
-      </w:r>
+      <w:r/>
+      <w:r/>
+      <w:r/>
+      <w:r/>
+      <w:r/>
+      <w:r/>
+      <w:r/>
+      <w:r/>
       <w:proofErr w:type="spellStart"/>
-      <w:r>
-        <w:t>SemEval</w:t>
-      </w:r>
+      <w:r/>
       <w:proofErr w:type="spellEnd"/>
-      <w:r>
-        <w:t xml:space="preserve"> </w:t>
-      </w:r>
-      <w:r>
-        <w:t>整體</w:t>
-      </w:r>
-      <w:r>
-        <w:t xml:space="preserve"> 66.99</w:t>
-      </w:r>
-      <w:r>
-        <w:t>、</w:t>
-      </w:r>
+      <w:r/>
+      <w:r/>
+      <w:r/>
+      <w:r/>
       <w:proofErr w:type="spellStart"/>
-      <w:r>
-        <w:t>MMAFFBen</w:t>
-      </w:r>
+      <w:r/>
       <w:proofErr w:type="spellEnd"/>
-      <w:r>
-        <w:t xml:space="preserve"> </w:t>
-      </w:r>
-      <w:r>
-        <w:t>平均</w:t>
-      </w:r>
-      <w:r>
-        <w:t xml:space="preserve"> 55.50</w:t>
-      </w:r>
-      <w:r>
-        <w:t>），在特定任務（英語情感強度、中文情感極性）上甚至超越規模大於其</w:t>
-      </w:r>
-      <w:r>
-        <w:t xml:space="preserve"> 16 </w:t>
-      </w:r>
-      <w:r>
-        <w:t>倍的模型。此特性對需要跨語言、跨情境應用情感感知能力的多代理系統具有直接的實用意義。</w:t>
-      </w:r>
+      <w:r/>
+      <w:r/>
+      <w:r/>
+      <w:r/>
+      <w:r/>
+      <w:r/>
     </w:p>
     <w:p>
       <w:pPr>

</xml_diff>